<commit_message>
feat: add documentation and exercise materials for Pareto and Ishikawa analysis
</commit_message>
<xml_diff>
--- a/OI/a0_pareto_ishikawa/Activite_Ishikawa_Pareto_Maintenance.docx
+++ b/OI/a0_pareto_ishikawa/Activite_Ishikawa_Pareto_Maintenance.docx
@@ -58,29 +58,8 @@
         <w:pStyle w:val="Titre1"/>
       </w:pPr>
       <w:bookmarkStart w:id="0" w:name="Xd822b4100c36808e47f4f90197c2c69e7c87547"/>
-      <w:proofErr w:type="spellStart"/>
-      <w:r>
-        <w:t>Activité</w:t>
-      </w:r>
-      <w:proofErr w:type="spellEnd"/>
-      <w:r>
-        <w:t xml:space="preserve"> </w:t>
-      </w:r>
-      <w:proofErr w:type="gramStart"/>
-      <w:r>
-        <w:t>Pratique :</w:t>
-      </w:r>
-      <w:proofErr w:type="gramEnd"/>
-      <w:r>
-        <w:t xml:space="preserve"> </w:t>
-      </w:r>
-      <w:proofErr w:type="spellStart"/>
-      <w:r>
-        <w:t>Méthodes</w:t>
-      </w:r>
-      <w:proofErr w:type="spellEnd"/>
-      <w:r>
-        <w:t xml:space="preserve"> de Résolution de Problèmes en Maintenance Industrielle</w:t>
+      <w:r>
+        <w:t>Activité Pratique : Méthodes de Résolution de Problèmes en Maintenance Industrielle</w:t>
       </w:r>
     </w:p>
     <w:p>
@@ -185,23 +164,17 @@
     </w:p>
     <w:p>
       <w:pPr>
-        <w:pStyle w:val="FirstParagraph"/>
-      </w:pPr>
-      <w:r>
-        <w:rPr>
-          <w:i/>
-          <w:iCs/>
-        </w:rPr>
-        <w:t>Durée conseillée : 45 minutes</w:t>
-      </w:r>
-    </w:p>
-    <w:p>
-      <w:pPr>
         <w:pStyle w:val="Titre3"/>
       </w:pPr>
       <w:bookmarkStart w:id="4" w:name="dégager-les-pistes-tempête-de-cerveaux"/>
       <w:r>
-        <w:t>1. Dégager les pistes (Tempête de cerveaux)</w:t>
+        <w:t>1. Dégager les pistes (</w:t>
+      </w:r>
+      <w:r>
+        <w:t>Brainstorming</w:t>
+      </w:r>
+      <w:r>
+        <w:t>)</w:t>
       </w:r>
     </w:p>
     <w:p>
@@ -371,60 +344,7 @@
       </w:pPr>
       <w:r>
         <w:lastRenderedPageBreak/>
-        <w:t xml:space="preserve">PARTIE </w:t>
-      </w:r>
-      <w:proofErr w:type="gramStart"/>
-      <w:r>
-        <w:t>2 :</w:t>
-      </w:r>
-      <w:proofErr w:type="gramEnd"/>
-      <w:r>
-        <w:t xml:space="preserve"> </w:t>
-      </w:r>
-      <w:proofErr w:type="spellStart"/>
-      <w:r>
-        <w:t>Analyse</w:t>
-      </w:r>
-      <w:proofErr w:type="spellEnd"/>
-      <w:r>
-        <w:t xml:space="preserve"> de Pareto et Priorisation (Individuel ou Binôme)</w:t>
-      </w:r>
-    </w:p>
-    <w:p>
-      <w:pPr>
-        <w:pStyle w:val="FirstParagraph"/>
-      </w:pPr>
-      <w:r>
-        <w:rPr>
-          <w:i/>
-          <w:iCs/>
-        </w:rPr>
-        <w:t xml:space="preserve">Durée </w:t>
-      </w:r>
-      <w:proofErr w:type="spellStart"/>
-      <w:proofErr w:type="gramStart"/>
-      <w:r>
-        <w:rPr>
-          <w:i/>
-          <w:iCs/>
-        </w:rPr>
-        <w:t>conseillée</w:t>
-      </w:r>
-      <w:proofErr w:type="spellEnd"/>
-      <w:r>
-        <w:rPr>
-          <w:i/>
-          <w:iCs/>
-        </w:rPr>
-        <w:t xml:space="preserve"> :</w:t>
-      </w:r>
-      <w:proofErr w:type="gramEnd"/>
-      <w:r>
-        <w:rPr>
-          <w:i/>
-          <w:iCs/>
-        </w:rPr>
-        <w:t xml:space="preserve"> 45 minutes</w:t>
+        <w:t>PARTIE 2 : Analyse de Pareto et Priorisation (Individuel ou Binôme)</w:t>
       </w:r>
     </w:p>
     <w:p>
@@ -961,7 +881,6 @@
           <w:b/>
           <w:bCs/>
         </w:rPr>
-        <w:lastRenderedPageBreak/>
         <w:t>Graphique :</w:t>
       </w:r>
     </w:p>
@@ -974,6 +893,7 @@
         </w:numPr>
       </w:pPr>
       <w:r>
+        <w:lastRenderedPageBreak/>
         <w:t>Tracez le diagramme de Pareto : un histogramme pour les temps d’arrêt (axe principal) et une courbe pour le pourcentage cumulé (axe secondaire).</w:t>
       </w:r>
     </w:p>
@@ -1046,23 +966,7 @@
       </w:pPr>
       <w:r>
         <w:lastRenderedPageBreak/>
-        <w:t xml:space="preserve">PARTIE </w:t>
-      </w:r>
-      <w:proofErr w:type="gramStart"/>
-      <w:r>
-        <w:t>3 :</w:t>
-      </w:r>
-      <w:proofErr w:type="gramEnd"/>
-      <w:r>
-        <w:t xml:space="preserve"> </w:t>
-      </w:r>
-      <w:proofErr w:type="spellStart"/>
-      <w:r>
-        <w:t>Synthèse</w:t>
-      </w:r>
-      <w:proofErr w:type="spellEnd"/>
-      <w:r>
-        <w:t xml:space="preserve"> et Plan d’Action</w:t>
+        <w:t>PARTIE 3 : Synthèse et Plan d’Action</w:t>
       </w:r>
     </w:p>
     <w:p>

</xml_diff>